<commit_message>
Renumber 1.1 example citations by first appearance and add reference list
Co-Authored-By: Claude Opus 5.5 <noreply@anthropic.com>
Claude-Session: https://claude.ai/code/session_01Frkd9CGJEqJyCuGNRjUru8
</commit_message>
<xml_diff>
--- a/example-1-1.docx
+++ b/example-1-1.docx
@@ -134,25 +134,7 @@
           <w:sz w:val="22"/>
           <w:szCs w:val="22"/>
         </w:rPr>
-        <w:t xml:space="preserve">: номер джерела з </w:t>
-      </w:r>
-      <w:r>
-        <w:rPr>
-          <w:rFonts w:ascii="Times New Roman" w:cs="Times New Roman" w:eastAsia="Times New Roman" w:hAnsi="Times New Roman"/>
-          <w:color w:val="7A4B00"/>
-          <w:sz w:val="22"/>
-          <w:szCs w:val="22"/>
-        </w:rPr>
-        <w:t xml:space="preserve">smm-thesis-sources.md</w:t>
-      </w:r>
-      <w:r>
-        <w:rPr>
-          <w:rFonts w:ascii="Times New Roman" w:cs="Times New Roman" w:eastAsia="Times New Roman" w:hAnsi="Times New Roman"/>
-          <w:color w:val="7A4B00"/>
-          <w:sz w:val="22"/>
-          <w:szCs w:val="22"/>
-        </w:rPr>
-        <w:t xml:space="preserve"> і місце для сторінки, яку треба знайти в оригіналі;</w:t>
+        <w:t xml:space="preserve">: номер джерела зі списку в кінці цього файлу і місце для сторінки, яку треба знайти в оригіналі;</w:t>
       </w:r>
     </w:p>
     <w:p>
@@ -313,7 +295,7 @@
           <w:sz w:val="28"/>
           <w:szCs w:val="28"/>
         </w:rPr>
-        <w:t xml:space="preserve">Сучасний етап розвитку економіки характеризується стрімкою цифровізацією всіх сфер суспільного життя, що докорінно змінює моделі поведінки споживачів і способи їхньої взаємодії з підприємствами. Соціальні мережі перетворилися з платформ міжособистісного спілкування на повноцінне середовище пошуку інформації, формування купівельних рішень та обміну досвідом споживання [7, с. __]. Для українського ринку ця тенденція є особливо виразною: станом на жовтень 2025 р. в Україні налічувалося 23,0 млн активних користувачів соціальних мереж, що становить 58,5 % населення країни, причому лише впродовж 2025 р. їхня кількість зросла на 1,4 млн осіб [39; 40]. За таких умов маркетингове просування в соціальних мережах набуває для підприємств не допоміжного, а стратегічного значення. Водночас його ефективне використання потребує уточнення сутності поняття маркетингового просування, визначення місця соціальних мереж у системі маркетингових комунікацій, розкриття специфіки SMM та його ролі у взаємодії підприємства з цільовою аудиторією.</w:t>
+        <w:t xml:space="preserve">Сучасний етап розвитку економіки характеризується стрімкою цифровізацією всіх сфер суспільного життя, що докорінно змінює моделі поведінки споживачів і способи їхньої взаємодії з підприємствами. Соціальні мережі перетворилися з платформ міжособистісного спілкування на повноцінне середовище пошуку інформації, формування купівельних рішень та обміну досвідом споживання [1, с. __]. Для українського ринку ця тенденція є особливо виразною: станом на жовтень 2025 р. в Україні налічувалося 23,0 млн активних користувачів соціальних мереж, що становить 58,5 % населення країни, причому лише впродовж 2025 р. їхня кількість зросла на 1,4 млн осіб [2; 3]. За таких умов маркетингове просування в соціальних мережах набуває для підприємств не допоміжного, а стратегічного значення. Водночас його ефективне використання потребує уточнення сутності поняття маркетингового просування, визначення місця соціальних мереж у системі маркетингових комунікацій, розкриття специфіки SMM та його ролі у взаємодії підприємства з цільовою аудиторією.</w:t>
       </w:r>
     </w:p>
     <w:p>
@@ -328,7 +310,7 @@
           <w:sz w:val="28"/>
           <w:szCs w:val="28"/>
         </w:rPr>
-        <w:t xml:space="preserve">Категорія «просування» посідає одне з центральних місць у концепції комплексу маркетингу «4P», запропонованій Е. Дж. Маккарті, та традиційно розглядається як його четвертий елемент — Promotion, поряд із товаром (Product), ціною (Price) та розподілом (Place) [42, с. __]. Водночас в українській науковій літературі англомовний термін «promotion» перекладається неоднозначно: як «просування», «маркетингові комунікації», «комунікаційна політика» або «система стимулювання збуту». Чіткого розмежування цих понять немає, що зумовлює потребу в уточненні їхнього змісту [41, с. __].</w:t>
+        <w:t xml:space="preserve">Категорія «просування» посідає одне з центральних місць у концепції комплексу маркетингу «4P», запропонованій Е. Дж. Маккарті, та традиційно розглядається як його четвертий елемент — Promotion, поряд із товаром (Product), ціною (Price) та розподілом (Place) [4, с. __]. Водночас в українській науковій літературі англомовний термін «promotion» перекладається неоднозначно: як «просування», «маркетингові комунікації», «комунікаційна політика» або «система стимулювання збуту». Чіткого розмежування цих понять немає, що зумовлює потребу в уточненні їхнього змісту [5, с. __].</w:t>
       </w:r>
     </w:p>
     <w:p>
@@ -512,7 +494,7 @@
                 <w:sz w:val="24"/>
                 <w:szCs w:val="24"/>
               </w:rPr>
-              <w:t xml:space="preserve">Котлер Ф., Келлер К. Л. [__, с. __]</w:t>
+              <w:t xml:space="preserve">Котлер Ф., Келлер К. Л. [6, с. __]</w:t>
             </w:r>
           </w:p>
         </w:tc>
@@ -620,7 +602,7 @@
                 <w:sz w:val="24"/>
                 <w:szCs w:val="24"/>
               </w:rPr>
-              <w:t xml:space="preserve">Сенишин О. С., Кривешко О. В. [42, с. __]</w:t>
+              <w:t xml:space="preserve">Сенишин О. С., Кривешко О. В. [4, с. __]</w:t>
             </w:r>
           </w:p>
         </w:tc>
@@ -720,7 +702,7 @@
                 <w:sz w:val="24"/>
                 <w:szCs w:val="24"/>
               </w:rPr>
-              <w:t xml:space="preserve">Романчик Т. В. [41, с. __]</w:t>
+              <w:t xml:space="preserve">Романчик Т. В. [5, с. __]</w:t>
             </w:r>
           </w:p>
         </w:tc>
@@ -820,7 +802,7 @@
                 <w:sz w:val="24"/>
                 <w:szCs w:val="24"/>
               </w:rPr>
-              <w:t xml:space="preserve">Окландер М. А. та ін. [1, с. __]</w:t>
+              <w:t xml:space="preserve">Окландер М. А. та ін. [7, с. __]</w:t>
             </w:r>
           </w:p>
         </w:tc>
@@ -918,7 +900,7 @@
                 <w:sz w:val="24"/>
                 <w:szCs w:val="24"/>
               </w:rPr>
-              <w:t xml:space="preserve">Chaffey D., Ellis-Chadwick F. [22, p. __]</w:t>
+              <w:t xml:space="preserve">Chaffey D., Ellis-Chadwick F. [8, p. __]</w:t>
             </w:r>
           </w:p>
         </w:tc>
@@ -1026,7 +1008,7 @@
                 <w:sz w:val="24"/>
                 <w:szCs w:val="24"/>
               </w:rPr>
-              <w:t xml:space="preserve">Закон України «Про рекламу» [43]</w:t>
+              <w:t xml:space="preserve">Закон України «Про рекламу» [9]</w:t>
             </w:r>
           </w:p>
         </w:tc>
@@ -1115,7 +1097,7 @@
           <w:sz w:val="24"/>
           <w:szCs w:val="24"/>
         </w:rPr>
-        <w:t xml:space="preserve">Систематизовано автором за [1; 22; 41; 42; 43]</w:t>
+        <w:t xml:space="preserve">Систематизовано автором за [4; 5; 7; 8; 9]</w:t>
       </w:r>
     </w:p>
     <w:p>
@@ -1265,7 +1247,7 @@
           <w:sz w:val="28"/>
           <w:szCs w:val="28"/>
         </w:rPr>
-        <w:t xml:space="preserve">Традиційно комплекс просування (promotion mix) охоплює рекламу, стимулювання збуту, зв'язки з громадськістю, особистий продаж і прямий маркетинг [42, с. __]. Проте розвиток цифрових технологій суттєво трансформував цей комплекс. Поряд із традиційними інструментами дедалі вагомішого значення набувають цифрові канали [1, с. __; 22, p. __], серед яких особливе місце посідають соціальні мережі.</w:t>
+        <w:t xml:space="preserve">Традиційно комплекс просування (promotion mix) охоплює рекламу, стимулювання збуту, зв'язки з громадськістю, особистий продаж і прямий маркетинг [4, с. __]. Проте розвиток цифрових технологій суттєво трансформував цей комплекс. Поряд із традиційними інструментами дедалі вагомішого значення набувають цифрові канали [7, с. __; 8, p. __], серед яких особливе місце посідають соціальні мережі.</w:t>
       </w:r>
     </w:p>
     <w:p>
@@ -1280,7 +1262,7 @@
           <w:sz w:val="28"/>
           <w:szCs w:val="28"/>
         </w:rPr>
-        <w:t xml:space="preserve">Для визначення місця соціальних мереж у системі маркетингових комунікацій доцільно насамперед розмежувати поняття «соціальні медіа» та «соціальні мережі», які в науковій і практичній літературі нерідко вживаються як синоніми. Одне з найбільш цитованих визначень соціальних медіа запропонували А. Каплан і М. Хенлайн. Вони розглядають їх як групу інтернет-застосунків, що ґрунтуються на ідеологічних і технологічних засадах Web 2.0 та дають змогу створювати контент, генерований користувачами (user-generated content, UGC), і обмінюватися ним [20, p. 61]. Автори класифікують соціальні медіа на шість груп: колективні проєкти, блоги, контент-спільноти, сайти соціальних мереж, віртуальні ігрові світи та віртуальні соціальні світи [20, p. __]. Отже, соціальні мережі (Facebook, Instagram, TikTok, LinkedIn тощо) є одним із видів соціальних медіа. Водночас саме вони сьогодні становлять основний канал маркетингової комунікації підприємств з аудиторією.</w:t>
+        <w:t xml:space="preserve">Для визначення місця соціальних мереж у системі маркетингових комунікацій доцільно насамперед розмежувати поняття «соціальні медіа» та «соціальні мережі», які в науковій і практичній літературі нерідко вживаються як синоніми. Одне з найбільш цитованих визначень соціальних медіа запропонували А. Каплан і М. Хенлайн. Вони розглядають їх як групу інтернет-застосунків, що ґрунтуються на ідеологічних і технологічних засадах Web 2.0 та дають змогу створювати контент, генерований користувачами (user-generated content, UGC), і обмінюватися ним [10, p. 61]. Автори класифікують соціальні медіа на шість груп: колективні проєкти, блоги, контент-спільноти, сайти соціальних мереж, віртуальні ігрові світи та віртуальні соціальні світи [10, p. __]. Отже, соціальні мережі (Facebook, Instagram, TikTok, LinkedIn тощо) є одним із видів соціальних медіа. Водночас саме вони сьогодні становлять основний канал маркетингової комунікації підприємств з аудиторією.</w:t>
       </w:r>
     </w:p>
     <w:p>
@@ -1295,7 +1277,7 @@
           <w:sz w:val="28"/>
           <w:szCs w:val="28"/>
         </w:rPr>
-        <w:t xml:space="preserve">Функціональні можливості соціальних медіа розкриває модель Я. Кіцманна та співавторів, яка виокремлює сім функціональних блоків: ідентичність, розмови, обмін, присутність, стосунки, репутацію та групи [25, p. __]. Різні платформи по-різному поєднують ці блоки. Тому, на думку авторів, підприємство має формувати стратегію присутності в соціальних медіа з урахуванням функціональної специфіки кожної платформи [25, p. __]. Для практики це означає, що вибір соціальних мереж для просування має ґрунтуватися на відповідності їхніх функціональних можливостей цілям комунікації та характеристикам цільової аудиторії.</w:t>
+        <w:t xml:space="preserve">Функціональні можливості соціальних медіа розкриває модель Я. Кіцманна та співавторів, яка виокремлює сім функціональних блоків: ідентичність, розмови, обмін, присутність, стосунки, репутацію та групи [11, p. __]. Різні платформи по-різному поєднують ці блоки. Тому, на думку авторів, підприємство має формувати стратегію присутності в соціальних медіа з урахуванням функціональної специфіки кожної платформи [11, p. __]. Для практики це означає, що вибір соціальних мереж для просування має ґрунтуватися на відповідності їхніх функціональних можливостей цілям комунікації та характеристикам цільової аудиторії.</w:t>
       </w:r>
     </w:p>
     <w:p>
@@ -1310,7 +1292,7 @@
           <w:sz w:val="28"/>
           <w:szCs w:val="28"/>
         </w:rPr>
-        <w:t xml:space="preserve">Ключову роль у розумінні місця соціальних мереж у системі маркетингових комунікацій відіграє концепція В. Г. Менголда та Д. Дж. Фолдса. Вони визначили соціальні медіа як «гібридний елемент» комплексу просування [24, p. __]. Гібридність полягає в тому, що соціальні медіа поєднують дві різні за природою форми комунікації. З одного боку, у традиційному сенсі вони дають змогу підприємству звертатися до споживачів. З іншого боку, у нетрадиційному сенсі вони дають змогу споживачам безпосередньо спілкуватися між собою [24, p. __]. Зміст, час і частота таких розмов між споживачами перебувають поза прямим контролем менеджменту. Через це завдання підприємства полягає вже не в повному контролі над повідомленнями, а у формуванні дискусій відповідно до власних цілей [24, p. __]. Місце соціальних мереж у системі маркетингових комунікацій підприємства відображено на рис. 1.1.</w:t>
+        <w:t xml:space="preserve">Ключову роль у розумінні місця соціальних мереж у системі маркетингових комунікацій відіграє концепція В. Г. Менголда та Д. Дж. Фолдса. Вони визначили соціальні медіа як «гібридний елемент» комплексу просування [12, p. __]. Гібридність полягає в тому, що соціальні медіа поєднують дві різні за природою форми комунікації. З одного боку, у традиційному сенсі вони дають змогу підприємству звертатися до споживачів. З іншого боку, у нетрадиційному сенсі вони дають змогу споживачам безпосередньо спілкуватися між собою [12, p. __]. Зміст, час і частота таких розмов між споживачами перебувають поза прямим контролем менеджменту. Через це завдання підприємства полягає вже не в повному контролі над повідомленнями, а у формуванні дискусій відповідно до власних цілей [12, p. __]. Місце соціальних мереж у системі маркетингових комунікацій підприємства відображено на рис. 1.1.</w:t>
       </w:r>
     </w:p>
     <w:p>
@@ -1546,7 +1528,7 @@
           <w:sz w:val="24"/>
           <w:szCs w:val="24"/>
         </w:rPr>
-        <w:t xml:space="preserve">Складено автором на основі [24; 26]</w:t>
+        <w:t xml:space="preserve">Складено автором на основі [12; 13]</w:t>
       </w:r>
     </w:p>
     <w:p>
@@ -1579,7 +1561,7 @@
           <w:sz w:val="28"/>
           <w:szCs w:val="28"/>
         </w:rPr>
-        <w:t xml:space="preserve">Важливо підкреслити, що соціальні мережі не функціонують у системі маркетингових комунікацій ізольовано. Р. Ханна, А. Ром і В. Кріттенден наголошують на необхідності розглядати соціальні медіа як частину ширшої екосистеми, у якій цифрові та традиційні канали взаємно підсилюють один одного [26, p. __]. Ефективність просування в соціальних мережах значною мірою залежить від їхньої інтеграції з вебсайтом підприємства, системами управління взаємовідносинами з клієнтами (CRM) та іншими каналами комунікації [38, с. __].</w:t>
+        <w:t xml:space="preserve">Важливо підкреслити, що соціальні мережі не функціонують у системі маркетингових комунікацій ізольовано. Р. Ханна, А. Ром і В. Кріттенден наголошують на необхідності розглядати соціальні медіа як частину ширшої екосистеми, у якій цифрові та традиційні канали взаємно підсилюють один одного [13, p. __]. Ефективність просування в соціальних мережах значною мірою залежить від їхньої інтеграції з вебсайтом підприємства, системами управління взаємовідносинами з клієнтами (CRM) та іншими каналами комунікації [14, с. __].</w:t>
       </w:r>
     </w:p>
     <w:p>
@@ -1763,7 +1745,7 @@
                 <w:sz w:val="24"/>
                 <w:szCs w:val="24"/>
               </w:rPr>
-              <w:t xml:space="preserve">Tuten T. L. [23, p. __]</w:t>
+              <w:t xml:space="preserve">Tuten T. L. [15, p. __]</w:t>
             </w:r>
           </w:p>
         </w:tc>
@@ -1873,7 +1855,7 @@
                 <w:sz w:val="24"/>
                 <w:szCs w:val="24"/>
               </w:rPr>
-              <w:t xml:space="preserve">Li F., Larimo J., Leonidou L. C. [50, p. __]</w:t>
+              <w:t xml:space="preserve">Li F., Larimo J., Leonidou L. C. [16, p. __]</w:t>
             </w:r>
           </w:p>
         </w:tc>
@@ -1981,7 +1963,7 @@
                 <w:sz w:val="24"/>
                 <w:szCs w:val="24"/>
               </w:rPr>
-              <w:t xml:space="preserve">Ярмолюк О., Фісун Ю., Шаповалова А. [2, с. __]</w:t>
+              <w:t xml:space="preserve">Ярмолюк О., Фісун Ю., Шаповалова А. [17, с. __]</w:t>
             </w:r>
           </w:p>
         </w:tc>
@@ -2081,7 +2063,7 @@
                 <w:sz w:val="24"/>
                 <w:szCs w:val="24"/>
               </w:rPr>
-              <w:t xml:space="preserve">Гірна О. та ін. [3, с. __]</w:t>
+              <w:t xml:space="preserve">Гірна О. та ін. [18, с. __]</w:t>
             </w:r>
           </w:p>
         </w:tc>
@@ -2181,7 +2163,7 @@
                 <w:sz w:val="24"/>
                 <w:szCs w:val="24"/>
               </w:rPr>
-              <w:t xml:space="preserve">Шиковець К., Мельник М. [8, с. __]</w:t>
+              <w:t xml:space="preserve">Шиковець К., Мельник М. [19, с. __]</w:t>
             </w:r>
           </w:p>
         </w:tc>
@@ -2279,7 +2261,7 @@
                 <w:sz w:val="24"/>
                 <w:szCs w:val="24"/>
               </w:rPr>
-              <w:t xml:space="preserve">Пімоненко Т. та ін. [10, с. __]</w:t>
+              <w:t xml:space="preserve">Пімоненко Т. та ін. [20, с. __]</w:t>
             </w:r>
           </w:p>
         </w:tc>
@@ -2460,7 +2442,7 @@
           <w:sz w:val="24"/>
           <w:szCs w:val="24"/>
         </w:rPr>
-        <w:t xml:space="preserve">Систематизовано автором за [2; 3; 8; 10; 23; 50]</w:t>
+        <w:t xml:space="preserve">Систематизовано автором за [15; 16; 17; 18; 19; 20]</w:t>
       </w:r>
     </w:p>
     <w:p>
@@ -2533,7 +2515,7 @@
           <w:sz w:val="28"/>
           <w:szCs w:val="28"/>
         </w:rPr>
-        <w:t xml:space="preserve"> частина дослідників акцентує увагу на інструментальному аспекті, тобто на сукупності інструментів і технологій просування. Інші наголошують на комунікаційному аспекті, тобто на взаємодії з аудиторією. Ф. Лі, Я. Ларімо та Л. Леонідоу розглядають SMM-стратегію з позицій стратегічного менеджменту. Вони виокремлюють чотири типи стратегій за рівнем зрілості: соціальну комерцію, соціальний контент, соціальний моніторинг і соціальну CRM [50, p. __].</w:t>
+        <w:t xml:space="preserve"> частина дослідників акцентує увагу на інструментальному аспекті, тобто на сукупності інструментів і технологій просування. Інші наголошують на комунікаційному аспекті, тобто на взаємодії з аудиторією. Ф. Лі, Я. Ларімо та Л. Леонідоу розглядають SMM-стратегію з позицій стратегічного менеджменту. Вони виокремлюють чотири типи стратегій за рівнем зрілості: соціальну комерцію, соціальний контент, соціальний моніторинг і соціальну CRM [16, p. __].</w:t>
       </w:r>
     </w:p>
     <w:p>
@@ -3598,7 +3580,7 @@
           <w:sz w:val="24"/>
           <w:szCs w:val="24"/>
         </w:rPr>
-        <w:t xml:space="preserve">Складено автором на основі [22; 24; 51]</w:t>
+        <w:t xml:space="preserve">Складено автором на основі [8; 12; 21]</w:t>
       </w:r>
     </w:p>
     <w:p>
@@ -3613,7 +3595,7 @@
           <w:sz w:val="28"/>
           <w:szCs w:val="28"/>
         </w:rPr>
-        <w:t xml:space="preserve">Як видно з табл. 1.3, принциповою відмінністю SMM є перехід від моделі трансляції повідомлень до моделі взаємодії. У ній споживач стає не лише адресатом, а й активним учасником комунікації. Особливого значення набуває електронна «сарафанна» комунікація (eWOM). Так, М. Трусов, Р. Баклін та К. Пауелс на прикладі соціальної мережі емпірично довели: рекомендації користувачів мають значно триваліший ефект і вищу еластичність відгуку, ніж традиційні маркетингові заходи. У довгостроковому періоді ефект таких рекомендацій виявився приблизно у 20 разів сильнішим за ефект подієвого маркетингу та у 30 разів — за ефект появ у медіа [51, p. __].</w:t>
+        <w:t xml:space="preserve">Як видно з табл. 1.3, принциповою відмінністю SMM є перехід від моделі трансляції повідомлень до моделі взаємодії. У ній споживач стає не лише адресатом, а й активним учасником комунікації. Особливого значення набуває електронна «сарафанна» комунікація (eWOM). Так, М. Трусов, Р. Баклін та К. Пауелс на прикладі соціальної мережі емпірично довели: рекомендації користувачів мають значно триваліший ефект і вищу еластичність відгуку, ніж традиційні маркетингові заходи. У довгостроковому періоді ефект таких рекомендацій виявився приблизно у 20 разів сильнішим за ефект подієвого маркетингу та у 30 разів — за ефект появ у медіа [21, p. __].</w:t>
       </w:r>
     </w:p>
     <w:p>
@@ -3685,7 +3667,7 @@
           <w:sz w:val="28"/>
           <w:szCs w:val="28"/>
         </w:rPr>
-        <w:t xml:space="preserve">оцінювання фінансової віддачі від SMM ускладнене. Як зазначають Д. Хоффман і М. Фодор, традиційний підхід до розрахунку ROI не завжди придатний для соціальних медіа, тож оцінювання слід починати з мотивів споживачів та їхніх «інвестицій» у взаємодію з брендом [19, p. __].</w:t>
+        <w:t xml:space="preserve">оцінювання фінансової віддачі від SMM ускладнене. Як зазначають Д. Хоффман і М. Фодор, традиційний підхід до розрахунку ROI не завжди придатний для соціальних медіа, тож оцінювання слід починати з мотивів споживачів та їхніх «інвестицій» у взаємодію з брендом [22, p. __].</w:t>
       </w:r>
     </w:p>
     <w:p>
@@ -3700,7 +3682,7 @@
           <w:sz w:val="28"/>
           <w:szCs w:val="28"/>
         </w:rPr>
-        <w:t xml:space="preserve">Розкриття специфіки SMM дає змогу визначити його роль у взаємодії підприємства з цільовою аудиторією. К. Ламбертон та Е. Стівен, узагальнивши дослідження 2000–2015 рр., виокремили три ключові ролі цифрових і соціальних медіа в маркетингу [49, p. __]:</w:t>
+        <w:t xml:space="preserve">Розкриття специфіки SMM дає змогу визначити його роль у взаємодії підприємства з цільовою аудиторією. К. Ламбертон та Е. Стівен, узагальнивши дослідження 2000–2015 рр., виокремили три ключові ролі цифрових і соціальних медіа в маркетингу [23, p. __]:</w:t>
       </w:r>
     </w:p>
     <w:p>
@@ -4048,7 +4030,7 @@
           <w:sz w:val="24"/>
           <w:szCs w:val="24"/>
         </w:rPr>
-        <w:t xml:space="preserve">(розроблено автором на основі [5; 6; 49])</w:t>
+        <w:t xml:space="preserve">(розроблено автором на основі [23; 24; 25])</w:t>
       </w:r>
     </w:p>
     <w:p>
@@ -4222,7 +4204,7 @@
           <w:sz w:val="28"/>
           <w:szCs w:val="28"/>
         </w:rPr>
-        <w:t xml:space="preserve"> спрямована на формування спільноти навколо бренду, стимулювання створення контенту користувачами та повторних покупок. Як показали Г. Дж. Шау, А. М. Муньїс та Е. Дж. Арнолд, практики бренд-спільнот створюють для споживачів цінність, яка виходить за межі цінності, що її пропонує сам виробник [52, p. __].</w:t>
+        <w:t xml:space="preserve"> спрямована на формування спільноти навколо бренду, стимулювання створення контенту користувачами та повторних покупок. Як показали Г. Дж. Шау, А. М. Муньїс та Е. Дж. Арнолд, практики бренд-спільнот створюють для споживачів цінність, яка виходить за межі цінності, що її пропонує сам виробник [26, p. __].</w:t>
       </w:r>
     </w:p>
     <w:p>
@@ -4424,7 +4406,7 @@
           <w:sz w:val="22"/>
           <w:szCs w:val="22"/>
         </w:rPr>
-        <w:t xml:space="preserve">: стовпчикову діаграму кількості користувачів основних платформ в Україні за даними звіту [39]. Вона покаже, які платформи найважливіші для українського бізнесу.]</w:t>
+        <w:t xml:space="preserve">: стовпчикову діаграму кількості користувачів основних платформ в Україні за даними звіту [2]. Вона покаже, які платформи найважливіші для українського бізнесу.]</w:t>
       </w:r>
     </w:p>
     <w:p>
@@ -4457,39 +4439,431 @@
           <w:sz w:val="28"/>
           <w:szCs w:val="28"/>
         </w:rPr>
-        <w:t xml:space="preserve">Що зробити з цим текстом (чек-лист)</w:t>
-      </w:r>
-    </w:p>
-    <w:p>
-      <w:pPr>
-        <w:spacing w:after="0" w:before="0" w:line="360"/>
-        <w:ind w:left="709"/>
-      </w:pPr>
-      <w:r>
-        <w:rPr>
-          <w:rFonts w:ascii="Times New Roman" w:cs="Times New Roman" w:eastAsia="Times New Roman" w:hAnsi="Times New Roman"/>
-          <w:sz w:val="28"/>
-          <w:szCs w:val="28"/>
-        </w:rPr>
-        <w:t xml:space="preserve">☐ Заповнити </w:t>
-      </w:r>
+        <w:t xml:space="preserve">СПИСОК ВИКОРИСТАНИХ ДЖЕРЕЛ (до підрозділу 1.1)</w:t>
+      </w:r>
+    </w:p>
+    <w:p>
+      <w:pPr>
+        <w:shd w:fill="FFF4CC" w:color="auto" w:val="clear"/>
+        <w:spacing w:after="60" w:before="0" w:line="276"/>
+        <w:ind w:left="170"/>
+      </w:pPr>
+      <w:r>
+        <w:rPr>
+          <w:rFonts w:ascii="Times New Roman" w:cs="Times New Roman" w:eastAsia="Times New Roman" w:hAnsi="Times New Roman"/>
+          <w:color w:val="7A4B00"/>
+          <w:sz w:val="22"/>
+          <w:szCs w:val="22"/>
+        </w:rPr>
+        <w:t xml:space="preserve">Нумерація — у порядку першого посилання в тексті. Коли писатимете всю роботу, список буде спільним для всіх розділів: джерела з наступних підрозділів продовжать нумерацію (27, 28, …).</w:t>
+      </w:r>
+    </w:p>
+    <w:p>
+      <w:pPr>
+        <w:spacing w:after="0" w:before="0" w:line="360"/>
+        <w:ind w:left="709" w:hanging="340"/>
+        <w:jc w:val="both"/>
+      </w:pPr>
+      <w:r>
+        <w:rPr>
+          <w:rFonts w:ascii="Times New Roman" w:cs="Times New Roman" w:eastAsia="Times New Roman" w:hAnsi="Times New Roman"/>
+          <w:sz w:val="28"/>
+          <w:szCs w:val="28"/>
+        </w:rPr>
+        <w:t xml:space="preserve">1. Яцківська А. Соціальні мережі як ефективний засіб просування бізнесу у світі. Суспільство та безпека. 2024. URL: https://sas.ztu.edu.ua/article/view/301984</w:t>
+      </w:r>
+    </w:p>
+    <w:p>
+      <w:pPr>
+        <w:spacing w:after="0" w:before="0" w:line="360"/>
+        <w:ind w:left="709" w:hanging="340"/>
+        <w:jc w:val="both"/>
+      </w:pPr>
+      <w:r>
+        <w:rPr>
+          <w:rFonts w:ascii="Times New Roman" w:cs="Times New Roman" w:eastAsia="Times New Roman" w:hAnsi="Times New Roman"/>
+          <w:sz w:val="28"/>
+          <w:szCs w:val="28"/>
+        </w:rPr>
+        <w:t xml:space="preserve">2. Digital 2026: Ukraine. DataReportal. 2025. URL: https://datareportal.com/reports/digital-2026-ukraine (дата звернення: дд.мм.рррр).</w:t>
+      </w:r>
+    </w:p>
+    <w:p>
+      <w:pPr>
+        <w:spacing w:after="0" w:before="0" w:line="360"/>
+        <w:ind w:left="709" w:hanging="340"/>
+        <w:jc w:val="both"/>
+      </w:pPr>
+      <w:r>
+        <w:rPr>
+          <w:rFonts w:ascii="Times New Roman" w:cs="Times New Roman" w:eastAsia="Times New Roman" w:hAnsi="Times New Roman"/>
+          <w:sz w:val="28"/>
+          <w:szCs w:val="28"/>
+        </w:rPr>
+        <w:t xml:space="preserve">3. Kemp S. Digital 2025: Ukraine. DataReportal. 2025. URL: https://datareportal.com/reports/digital-2025-ukraine (дата звернення: дд.мм.рррр).</w:t>
+      </w:r>
+    </w:p>
+    <w:p>
+      <w:pPr>
+        <w:spacing w:after="0" w:before="0" w:line="360"/>
+        <w:ind w:left="709" w:hanging="340"/>
+        <w:jc w:val="both"/>
+      </w:pPr>
+      <w:r>
+        <w:rPr>
+          <w:rFonts w:ascii="Times New Roman" w:cs="Times New Roman" w:eastAsia="Times New Roman" w:hAnsi="Times New Roman"/>
+          <w:sz w:val="28"/>
+          <w:szCs w:val="28"/>
+        </w:rPr>
+        <w:t xml:space="preserve">4. Сенишин О. С., Кривешко О. В. Маркетинг : навч. посіб. Львів : ЛНУ імені Івана Франка, 2020. URL: https://econom.lnu.edu.ua/wp-content/uploads/2016/10/MARKETING_NAVCH.POSIBNYK_SENYSHYN-KRYVESHKO_FINAL_ALL.pdf</w:t>
+      </w:r>
+    </w:p>
+    <w:p>
+      <w:pPr>
+        <w:spacing w:after="0" w:before="0" w:line="360"/>
+        <w:ind w:left="709" w:hanging="340"/>
+        <w:jc w:val="both"/>
+      </w:pPr>
+      <w:r>
+        <w:rPr>
+          <w:rFonts w:ascii="Times New Roman" w:cs="Times New Roman" w:eastAsia="Times New Roman" w:hAnsi="Times New Roman"/>
+          <w:sz w:val="28"/>
+          <w:szCs w:val="28"/>
+        </w:rPr>
+        <w:t xml:space="preserve">5. Романчик Т. В. Просування в системі маркетингових комунікацій: методологічні підходи. Вісник Національного технічного університету «ХПІ». Серія: Економічні науки. 2017. № 45 (1266). URL: https://repository.kpi.kharkov.ua/handle/KhPI-Press/33912</w:t>
+      </w:r>
+    </w:p>
+    <w:p>
+      <w:pPr>
+        <w:spacing w:after="0" w:before="0" w:line="360"/>
+        <w:ind w:left="709" w:hanging="340"/>
+        <w:jc w:val="both"/>
+      </w:pPr>
+      <w:r>
+        <w:rPr>
+          <w:rFonts w:ascii="Times New Roman" w:cs="Times New Roman" w:eastAsia="Times New Roman" w:hAnsi="Times New Roman"/>
+          <w:sz w:val="28"/>
+          <w:szCs w:val="28"/>
+        </w:rPr>
+        <w:t xml:space="preserve">6. Котлер Ф., Келлер К. Л. Маркетинговий менеджмент / пер. з англ. (місто, видавництво, рік і кількість сторінок уточнити за бібліотечним каталогом).</w:t>
+      </w:r>
+    </w:p>
+    <w:p>
+      <w:pPr>
+        <w:spacing w:after="0" w:before="0" w:line="360"/>
+        <w:ind w:left="709" w:hanging="340"/>
+        <w:jc w:val="both"/>
+      </w:pPr>
+      <w:r>
+        <w:rPr>
+          <w:rFonts w:ascii="Times New Roman" w:cs="Times New Roman" w:eastAsia="Times New Roman" w:hAnsi="Times New Roman"/>
+          <w:sz w:val="28"/>
+          <w:szCs w:val="28"/>
+        </w:rPr>
+        <w:t xml:space="preserve">7. Окландер М. А., Окландер Т. О., Яшкіна О. І. та ін. Цифровий маркетинг – модель маркетингу ХХІ сторіччя : монографія. Одеса : Астропринт, 2017. 292 с. URL: https://dspace.opu.ua/jspui/handle/123456789/7012</w:t>
+      </w:r>
+    </w:p>
+    <w:p>
+      <w:pPr>
+        <w:spacing w:after="0" w:before="0" w:line="360"/>
+        <w:ind w:left="709" w:hanging="340"/>
+        <w:jc w:val="both"/>
+      </w:pPr>
+      <w:r>
+        <w:rPr>
+          <w:rFonts w:ascii="Times New Roman" w:cs="Times New Roman" w:eastAsia="Times New Roman" w:hAnsi="Times New Roman"/>
+          <w:sz w:val="28"/>
+          <w:szCs w:val="28"/>
+        </w:rPr>
+        <w:t xml:space="preserve">8. Chaffey D., Ellis-Chadwick F. Digital Marketing: Strategy, Implementation and Practice. 8th ed. Harlow : Pearson, 2022.</w:t>
+      </w:r>
+    </w:p>
+    <w:p>
+      <w:pPr>
+        <w:spacing w:after="0" w:before="0" w:line="360"/>
+        <w:ind w:left="709" w:hanging="340"/>
+        <w:jc w:val="both"/>
+      </w:pPr>
+      <w:r>
+        <w:rPr>
+          <w:rFonts w:ascii="Times New Roman" w:cs="Times New Roman" w:eastAsia="Times New Roman" w:hAnsi="Times New Roman"/>
+          <w:sz w:val="28"/>
+          <w:szCs w:val="28"/>
+        </w:rPr>
+        <w:t xml:space="preserve">9. Про рекламу : Закон України від 03.07.1996 № 270/96-ВР. URL: https://zakon.rada.gov.ua/laws/show/270/96-вр (дата звернення: дд.мм.рррр).</w:t>
+      </w:r>
+    </w:p>
+    <w:p>
+      <w:pPr>
+        <w:spacing w:after="0" w:before="0" w:line="360"/>
+        <w:ind w:left="709" w:hanging="340"/>
+        <w:jc w:val="both"/>
+      </w:pPr>
+      <w:r>
+        <w:rPr>
+          <w:rFonts w:ascii="Times New Roman" w:cs="Times New Roman" w:eastAsia="Times New Roman" w:hAnsi="Times New Roman"/>
+          <w:sz w:val="28"/>
+          <w:szCs w:val="28"/>
+        </w:rPr>
+        <w:t xml:space="preserve">10. Kaplan A. M., Haenlein M. Users of the world, unite! The challenges and opportunities of Social Media. Business Horizons. 2010. Vol. 53, No. 1. P. 59–68. DOI: https://doi.org/10.1016/j.bushor.2009.09.003</w:t>
+      </w:r>
+    </w:p>
+    <w:p>
+      <w:pPr>
+        <w:spacing w:after="0" w:before="0" w:line="360"/>
+        <w:ind w:left="709" w:hanging="340"/>
+        <w:jc w:val="both"/>
+      </w:pPr>
+      <w:r>
+        <w:rPr>
+          <w:rFonts w:ascii="Times New Roman" w:cs="Times New Roman" w:eastAsia="Times New Roman" w:hAnsi="Times New Roman"/>
+          <w:sz w:val="28"/>
+          <w:szCs w:val="28"/>
+        </w:rPr>
+        <w:t xml:space="preserve">11. Kietzmann J. H., Hermkens K., McCarthy I. P., Silvestre B. S. Social media? Get serious! Understanding the functional building blocks of social media. Business Horizons. 2011. Vol. 54, No. 3. P. 241–251. DOI: https://doi.org/10.1016/j.bushor.2011.01.005</w:t>
+      </w:r>
+    </w:p>
+    <w:p>
+      <w:pPr>
+        <w:spacing w:after="0" w:before="0" w:line="360"/>
+        <w:ind w:left="709" w:hanging="340"/>
+        <w:jc w:val="both"/>
+      </w:pPr>
+      <w:r>
+        <w:rPr>
+          <w:rFonts w:ascii="Times New Roman" w:cs="Times New Roman" w:eastAsia="Times New Roman" w:hAnsi="Times New Roman"/>
+          <w:sz w:val="28"/>
+          <w:szCs w:val="28"/>
+        </w:rPr>
+        <w:t xml:space="preserve">12. Mangold W. G., Faulds D. J. Social media: The new hybrid element of the promotion mix. Business Horizons. 2009. Vol. 52, No. 4. P. 357–365. DOI: https://doi.org/10.1016/j.bushor.2009.03.002</w:t>
+      </w:r>
+    </w:p>
+    <w:p>
+      <w:pPr>
+        <w:spacing w:after="0" w:before="0" w:line="360"/>
+        <w:ind w:left="709" w:hanging="340"/>
+        <w:jc w:val="both"/>
+      </w:pPr>
+      <w:r>
+        <w:rPr>
+          <w:rFonts w:ascii="Times New Roman" w:cs="Times New Roman" w:eastAsia="Times New Roman" w:hAnsi="Times New Roman"/>
+          <w:sz w:val="28"/>
+          <w:szCs w:val="28"/>
+        </w:rPr>
+        <w:t xml:space="preserve">13. Hanna R., Rohm A., Crittenden V. L. We're all connected: The power of the social media ecosystem. Business Horizons. 2011. Vol. 54, No. 3. P. 265–273. DOI: https://doi.org/10.1016/j.bushor.2011.01.007</w:t>
+      </w:r>
+    </w:p>
+    <w:p>
+      <w:pPr>
+        <w:spacing w:after="0" w:before="0" w:line="360"/>
+        <w:ind w:left="709" w:hanging="340"/>
+        <w:jc w:val="both"/>
+      </w:pPr>
+      <w:r>
+        <w:rPr>
+          <w:rFonts w:ascii="Times New Roman" w:cs="Times New Roman" w:eastAsia="Times New Roman" w:hAnsi="Times New Roman"/>
+          <w:sz w:val="28"/>
+          <w:szCs w:val="28"/>
+        </w:rPr>
+        <w:t xml:space="preserve">14. Головко О. А. Інтеграція вебсайту та соціальних мереж як стратегія сучасної комунікації. Обрії друкарства. 2024. URL: https://horizons.vpi.kpi.ua/article/view/319343</w:t>
+      </w:r>
+    </w:p>
+    <w:p>
+      <w:pPr>
+        <w:spacing w:after="0" w:before="0" w:line="360"/>
+        <w:ind w:left="709" w:hanging="340"/>
+        <w:jc w:val="both"/>
+      </w:pPr>
+      <w:r>
+        <w:rPr>
+          <w:rFonts w:ascii="Times New Roman" w:cs="Times New Roman" w:eastAsia="Times New Roman" w:hAnsi="Times New Roman"/>
+          <w:sz w:val="28"/>
+          <w:szCs w:val="28"/>
+        </w:rPr>
+        <w:t xml:space="preserve">15. Tuten T. L. Social Media Marketing. 5th ed. London : SAGE Publications, 2023.</w:t>
+      </w:r>
+    </w:p>
+    <w:p>
+      <w:pPr>
+        <w:spacing w:after="0" w:before="0" w:line="360"/>
+        <w:ind w:left="709" w:hanging="340"/>
+        <w:jc w:val="both"/>
+      </w:pPr>
+      <w:r>
+        <w:rPr>
+          <w:rFonts w:ascii="Times New Roman" w:cs="Times New Roman" w:eastAsia="Times New Roman" w:hAnsi="Times New Roman"/>
+          <w:sz w:val="28"/>
+          <w:szCs w:val="28"/>
+        </w:rPr>
+        <w:t xml:space="preserve">16. Li F., Larimo J., Leonidou L. C. Social media marketing strategy: definition, conceptualization, taxonomy, validation, and future agenda. Journal of the Academy of Marketing Science. 2021. Vol. 49, No. 1. P. 51–70. DOI: https://doi.org/10.1007/s11747-020-00733-3</w:t>
+      </w:r>
+    </w:p>
+    <w:p>
+      <w:pPr>
+        <w:spacing w:after="0" w:before="0" w:line="360"/>
+        <w:ind w:left="709" w:hanging="340"/>
+        <w:jc w:val="both"/>
+      </w:pPr>
+      <w:r>
+        <w:rPr>
+          <w:rFonts w:ascii="Times New Roman" w:cs="Times New Roman" w:eastAsia="Times New Roman" w:hAnsi="Times New Roman"/>
+          <w:sz w:val="28"/>
+          <w:szCs w:val="28"/>
+        </w:rPr>
+        <w:t xml:space="preserve">17. Ярмолюк О., Фісун Ю., Шаповалова А. Соціальні мережі як сучасний інструмент просування. Підприємництво та інновації. 2020. Вип. 11-2. С. 62–65. URL: https://ei-journal.in.ua/index.php/journal/article/view/287</w:t>
+      </w:r>
+    </w:p>
+    <w:p>
+      <w:pPr>
+        <w:spacing w:after="0" w:before="0" w:line="360"/>
+        <w:ind w:left="709" w:hanging="340"/>
+        <w:jc w:val="both"/>
+      </w:pPr>
+      <w:r>
+        <w:rPr>
+          <w:rFonts w:ascii="Times New Roman" w:cs="Times New Roman" w:eastAsia="Times New Roman" w:hAnsi="Times New Roman"/>
+          <w:sz w:val="28"/>
+          <w:szCs w:val="28"/>
+        </w:rPr>
+        <w:t xml:space="preserve">18. Гірна О., Гайворонська І., Власенко Д., Бродюк І., Вербицька А. До питання вдосконалення українських підприємницьких стратегій: digital-маркетинг як сучасний інструмент просування товарів та послуг у соціальних мережах. Фінансово-кредитна діяльність: проблеми теорії та практики. 2022. Т. 2, № 43. С. 349–356. DOI: https://doi.org/10.55643/fcaptp.2.43.2022.3752</w:t>
+      </w:r>
+    </w:p>
+    <w:p>
+      <w:pPr>
+        <w:spacing w:after="0" w:before="0" w:line="360"/>
+        <w:ind w:left="709" w:hanging="340"/>
+        <w:jc w:val="both"/>
+      </w:pPr>
+      <w:r>
+        <w:rPr>
+          <w:rFonts w:ascii="Times New Roman" w:cs="Times New Roman" w:eastAsia="Times New Roman" w:hAnsi="Times New Roman"/>
+          <w:sz w:val="28"/>
+          <w:szCs w:val="28"/>
+        </w:rPr>
+        <w:t xml:space="preserve">19. Шиковець К., Мельник М. Маркетинг соціальних мереж як важливий інструмент комунікацій. Економіка та суспільство. 2024. № 66. DOI: https://doi.org/10.32782/2524-0072/2024-66-113</w:t>
+      </w:r>
+    </w:p>
+    <w:p>
+      <w:pPr>
+        <w:spacing w:after="0" w:before="0" w:line="360"/>
+        <w:ind w:left="709" w:hanging="340"/>
+        <w:jc w:val="both"/>
+      </w:pPr>
+      <w:r>
+        <w:rPr>
+          <w:rFonts w:ascii="Times New Roman" w:cs="Times New Roman" w:eastAsia="Times New Roman" w:hAnsi="Times New Roman"/>
+          <w:sz w:val="28"/>
+          <w:szCs w:val="28"/>
+        </w:rPr>
+        <w:t xml:space="preserve">20. Пімоненко Т., Люльов О., Здойма А., Пімоненко С. Маркетингова стратегія в соціальних мережах: теоретико-прикладний базис. Вісник Сумського державного університету. Серія «Економіка». 2023. № 1. С. 17–26. URL: https://visnyk.fem.sumdu.edu.ua/uk/1-2023-2</w:t>
+      </w:r>
+    </w:p>
+    <w:p>
+      <w:pPr>
+        <w:spacing w:after="0" w:before="0" w:line="360"/>
+        <w:ind w:left="709" w:hanging="340"/>
+        <w:jc w:val="both"/>
+      </w:pPr>
+      <w:r>
+        <w:rPr>
+          <w:rFonts w:ascii="Times New Roman" w:cs="Times New Roman" w:eastAsia="Times New Roman" w:hAnsi="Times New Roman"/>
+          <w:sz w:val="28"/>
+          <w:szCs w:val="28"/>
+        </w:rPr>
+        <w:t xml:space="preserve">21. Trusov M., Bucklin R. E., Pauwels K. Effects of word-of-mouth versus traditional marketing: Findings from an internet social networking site. Journal of Marketing. 2009. Vol. 73, No. 5. P. 90–102. DOI: https://doi.org/10.1509/jmkg.73.5.90</w:t>
+      </w:r>
+    </w:p>
+    <w:p>
+      <w:pPr>
+        <w:spacing w:after="0" w:before="0" w:line="360"/>
+        <w:ind w:left="709" w:hanging="340"/>
+        <w:jc w:val="both"/>
+      </w:pPr>
+      <w:r>
+        <w:rPr>
+          <w:rFonts w:ascii="Times New Roman" w:cs="Times New Roman" w:eastAsia="Times New Roman" w:hAnsi="Times New Roman"/>
+          <w:sz w:val="28"/>
+          <w:szCs w:val="28"/>
+        </w:rPr>
+        <w:t xml:space="preserve">22. Hoffman D. L., Fodor M. Can You Measure the ROI of Your Social Media Marketing? MIT Sloan Management Review. 2010. Vol. 52, No. 1. P. 41–49.</w:t>
+      </w:r>
+    </w:p>
+    <w:p>
+      <w:pPr>
+        <w:spacing w:after="0" w:before="0" w:line="360"/>
+        <w:ind w:left="709" w:hanging="340"/>
+        <w:jc w:val="both"/>
+      </w:pPr>
+      <w:r>
+        <w:rPr>
+          <w:rFonts w:ascii="Times New Roman" w:cs="Times New Roman" w:eastAsia="Times New Roman" w:hAnsi="Times New Roman"/>
+          <w:sz w:val="28"/>
+          <w:szCs w:val="28"/>
+        </w:rPr>
+        <w:t xml:space="preserve">23. Lamberton C., Stephen A. T. A thematic exploration of digital, social media, and mobile marketing: Research evolution from 2000 to 2015 and an agenda for future inquiry. Journal of Marketing. 2016. Vol. 80, No. 6. P. 146–172.</w:t>
+      </w:r>
+    </w:p>
+    <w:p>
+      <w:pPr>
+        <w:spacing w:after="0" w:before="0" w:line="360"/>
+        <w:ind w:left="709" w:hanging="340"/>
+        <w:jc w:val="both"/>
+      </w:pPr>
+      <w:r>
+        <w:rPr>
+          <w:rFonts w:ascii="Times New Roman" w:cs="Times New Roman" w:eastAsia="Times New Roman" w:hAnsi="Times New Roman"/>
+          <w:sz w:val="28"/>
+          <w:szCs w:val="28"/>
+        </w:rPr>
+        <w:t xml:space="preserve">24. Капінус Л. В. Вплив соціальних мереж на маркетингову поведінку підприємства на онлайн-ринку. Таврійський науковий вісник. Серія: Економіка. 2023. Вип. 18. С. 86–93. URL: https://tnv-econom.ksauniv.ks.ua/index.php/journal/article/view/439</w:t>
+      </w:r>
+    </w:p>
+    <w:p>
+      <w:pPr>
+        <w:spacing w:after="0" w:before="0" w:line="360"/>
+        <w:ind w:left="709" w:hanging="340"/>
+        <w:jc w:val="both"/>
+      </w:pPr>
+      <w:r>
+        <w:rPr>
+          <w:rFonts w:ascii="Times New Roman" w:cs="Times New Roman" w:eastAsia="Times New Roman" w:hAnsi="Times New Roman"/>
+          <w:sz w:val="28"/>
+          <w:szCs w:val="28"/>
+        </w:rPr>
+        <w:t xml:space="preserve">25. Решетнікова О. В., Боровик Т., Сенько І. Маркетинг в соціальних мережах як інструмент просування бренду та підвищення обсягів збуту. Економіка та суспільство. 2024. № 65. DOI: https://doi.org/10.32782/2524-0072/2024-65-128</w:t>
+      </w:r>
+    </w:p>
+    <w:p>
+      <w:pPr>
+        <w:spacing w:after="0" w:before="0" w:line="360"/>
+        <w:ind w:left="709" w:hanging="340"/>
+        <w:jc w:val="both"/>
+      </w:pPr>
+      <w:r>
+        <w:rPr>
+          <w:rFonts w:ascii="Times New Roman" w:cs="Times New Roman" w:eastAsia="Times New Roman" w:hAnsi="Times New Roman"/>
+          <w:sz w:val="28"/>
+          <w:szCs w:val="28"/>
+        </w:rPr>
+        <w:t xml:space="preserve">26. Schau H. J., Muñiz A. M., Arnould E. J. How brand community practices create value. Journal of Marketing. 2009. Vol. 73, No. 5. P. 30–51.</w:t>
+      </w:r>
+    </w:p>
+    <w:p>
+      <w:pPr>
+        <w:pStyle w:val="Heading2"/>
+        <w:spacing w:after="240" w:before="240" w:line="360"/>
+        <w:ind w:firstLine="709"/>
+      </w:pPr>
       <w:r>
         <w:rPr>
           <w:rFonts w:ascii="Times New Roman" w:cs="Times New Roman" w:eastAsia="Times New Roman" w:hAnsi="Times New Roman"/>
           <w:b/>
           <w:bCs/>
-          <w:sz w:val="28"/>
-          <w:szCs w:val="28"/>
-        </w:rPr>
-        <w:t xml:space="preserve">табл. 1.1 і 1.2</w:t>
-      </w:r>
-      <w:r>
-        <w:rPr>
-          <w:rFonts w:ascii="Times New Roman" w:cs="Times New Roman" w:eastAsia="Times New Roman" w:hAnsi="Times New Roman"/>
-          <w:sz w:val="28"/>
-          <w:szCs w:val="28"/>
-        </w:rPr>
-        <w:t xml:space="preserve"> дослівними цитатами з джерел (зі сторінками) і колонкою «акцент».</w:t>
+          <w:color w:val="000000"/>
+          <w:sz w:val="28"/>
+          <w:szCs w:val="28"/>
+        </w:rPr>
+        <w:t xml:space="preserve">Що зробити з цим текстом (чек-лист)</w:t>
       </w:r>
     </w:p>
     <w:p>
@@ -4503,7 +4877,7 @@
           <w:sz w:val="28"/>
           <w:szCs w:val="28"/>
         </w:rPr>
-        <w:t xml:space="preserve">☐ Скоригувати </w:t>
+        <w:t xml:space="preserve">☐ Заповнити </w:t>
       </w:r>
       <w:r>
         <w:rPr>
@@ -4513,15 +4887,15 @@
           <w:sz w:val="28"/>
           <w:szCs w:val="28"/>
         </w:rPr>
-        <w:t xml:space="preserve">абзаци аналізу</w:t>
-      </w:r>
-      <w:r>
-        <w:rPr>
-          <w:rFonts w:ascii="Times New Roman" w:cs="Times New Roman" w:eastAsia="Times New Roman" w:hAnsi="Times New Roman"/>
-          <w:sz w:val="28"/>
-          <w:szCs w:val="28"/>
-        </w:rPr>
-        <w:t xml:space="preserve"> після таблиць під реальні визначення.</w:t>
+        <w:t xml:space="preserve">табл. 1.1 і 1.2</w:t>
+      </w:r>
+      <w:r>
+        <w:rPr>
+          <w:rFonts w:ascii="Times New Roman" w:cs="Times New Roman" w:eastAsia="Times New Roman" w:hAnsi="Times New Roman"/>
+          <w:sz w:val="28"/>
+          <w:szCs w:val="28"/>
+        </w:rPr>
+        <w:t xml:space="preserve"> дослівними цитатами з джерел (зі сторінками) і колонкою «акцент».</w:t>
       </w:r>
     </w:p>
     <w:p>
@@ -4535,7 +4909,7 @@
           <w:sz w:val="28"/>
           <w:szCs w:val="28"/>
         </w:rPr>
-        <w:t xml:space="preserve">☐ Сформулювати </w:t>
+        <w:t xml:space="preserve">☐ Скоригувати </w:t>
       </w:r>
       <w:r>
         <w:rPr>
@@ -4545,15 +4919,15 @@
           <w:sz w:val="28"/>
           <w:szCs w:val="28"/>
         </w:rPr>
-        <w:t xml:space="preserve">власне авторське визначення</w:t>
-      </w:r>
-      <w:r>
-        <w:rPr>
-          <w:rFonts w:ascii="Times New Roman" w:cs="Times New Roman" w:eastAsia="Times New Roman" w:hAnsi="Times New Roman"/>
-          <w:sz w:val="28"/>
-          <w:szCs w:val="28"/>
-        </w:rPr>
-        <w:t xml:space="preserve">.</w:t>
+        <w:t xml:space="preserve">абзаци аналізу</w:t>
+      </w:r>
+      <w:r>
+        <w:rPr>
+          <w:rFonts w:ascii="Times New Roman" w:cs="Times New Roman" w:eastAsia="Times New Roman" w:hAnsi="Times New Roman"/>
+          <w:sz w:val="28"/>
+          <w:szCs w:val="28"/>
+        </w:rPr>
+        <w:t xml:space="preserve"> після таблиць під реальні визначення.</w:t>
       </w:r>
     </w:p>
     <w:p>
@@ -4567,7 +4941,7 @@
           <w:sz w:val="28"/>
           <w:szCs w:val="28"/>
         </w:rPr>
-        <w:t xml:space="preserve">☐ Знайти сторінки для всіх </w:t>
+        <w:t xml:space="preserve">☐ Сформулювати </w:t>
       </w:r>
       <w:r>
         <w:rPr>
@@ -4577,15 +4951,29 @@
           <w:sz w:val="28"/>
           <w:szCs w:val="28"/>
         </w:rPr>
-        <w:t xml:space="preserve">[N, с. __]</w:t>
-      </w:r>
-      <w:r>
-        <w:rPr>
-          <w:rFonts w:ascii="Times New Roman" w:cs="Times New Roman" w:eastAsia="Times New Roman" w:hAnsi="Times New Roman"/>
-          <w:sz w:val="28"/>
-          <w:szCs w:val="28"/>
-        </w:rPr>
-        <w:t xml:space="preserve">, а англомовні цитувати як </w:t>
+        <w:t xml:space="preserve">власне авторське визначення</w:t>
+      </w:r>
+      <w:r>
+        <w:rPr>
+          <w:rFonts w:ascii="Times New Roman" w:cs="Times New Roman" w:eastAsia="Times New Roman" w:hAnsi="Times New Roman"/>
+          <w:sz w:val="28"/>
+          <w:szCs w:val="28"/>
+        </w:rPr>
+        <w:t xml:space="preserve">.</w:t>
+      </w:r>
+    </w:p>
+    <w:p>
+      <w:pPr>
+        <w:spacing w:after="0" w:before="0" w:line="360"/>
+        <w:ind w:left="709"/>
+      </w:pPr>
+      <w:r>
+        <w:rPr>
+          <w:rFonts w:ascii="Times New Roman" w:cs="Times New Roman" w:eastAsia="Times New Roman" w:hAnsi="Times New Roman"/>
+          <w:sz w:val="28"/>
+          <w:szCs w:val="28"/>
+        </w:rPr>
+        <w:t xml:space="preserve">☐ Знайти сторінки для всіх </w:t>
       </w:r>
       <w:r>
         <w:rPr>
@@ -4595,29 +4983,15 @@
           <w:sz w:val="28"/>
           <w:szCs w:val="28"/>
         </w:rPr>
-        <w:t xml:space="preserve">[N, p. X]</w:t>
-      </w:r>
-      <w:r>
-        <w:rPr>
-          <w:rFonts w:ascii="Times New Roman" w:cs="Times New Roman" w:eastAsia="Times New Roman" w:hAnsi="Times New Roman"/>
-          <w:sz w:val="28"/>
-          <w:szCs w:val="28"/>
-        </w:rPr>
-        <w:t xml:space="preserve">.</w:t>
-      </w:r>
-    </w:p>
-    <w:p>
-      <w:pPr>
-        <w:spacing w:after="0" w:before="0" w:line="360"/>
-        <w:ind w:left="709"/>
-      </w:pPr>
-      <w:r>
-        <w:rPr>
-          <w:rFonts w:ascii="Times New Roman" w:cs="Times New Roman" w:eastAsia="Times New Roman" w:hAnsi="Times New Roman"/>
-          <w:sz w:val="28"/>
-          <w:szCs w:val="28"/>
-        </w:rPr>
-        <w:t xml:space="preserve">☐ Перевірити твердження про </w:t>
+        <w:t xml:space="preserve">[N, с. __]</w:t>
+      </w:r>
+      <w:r>
+        <w:rPr>
+          <w:rFonts w:ascii="Times New Roman" w:cs="Times New Roman" w:eastAsia="Times New Roman" w:hAnsi="Times New Roman"/>
+          <w:sz w:val="28"/>
+          <w:szCs w:val="28"/>
+        </w:rPr>
+        <w:t xml:space="preserve">, а англомовні цитувати як </w:t>
       </w:r>
       <w:r>
         <w:rPr>
@@ -4627,15 +5001,29 @@
           <w:sz w:val="28"/>
           <w:szCs w:val="28"/>
         </w:rPr>
-        <w:t xml:space="preserve">Трусова (20× і 30×)</w:t>
-      </w:r>
-      <w:r>
-        <w:rPr>
-          <w:rFonts w:ascii="Times New Roman" w:cs="Times New Roman" w:eastAsia="Times New Roman" w:hAnsi="Times New Roman"/>
-          <w:sz w:val="28"/>
-          <w:szCs w:val="28"/>
-        </w:rPr>
-        <w:t xml:space="preserve">, </w:t>
+        <w:t xml:space="preserve">[N, p. X]</w:t>
+      </w:r>
+      <w:r>
+        <w:rPr>
+          <w:rFonts w:ascii="Times New Roman" w:cs="Times New Roman" w:eastAsia="Times New Roman" w:hAnsi="Times New Roman"/>
+          <w:sz w:val="28"/>
+          <w:szCs w:val="28"/>
+        </w:rPr>
+        <w:t xml:space="preserve">.</w:t>
+      </w:r>
+    </w:p>
+    <w:p>
+      <w:pPr>
+        <w:spacing w:after="0" w:before="0" w:line="360"/>
+        <w:ind w:left="709"/>
+      </w:pPr>
+      <w:r>
+        <w:rPr>
+          <w:rFonts w:ascii="Times New Roman" w:cs="Times New Roman" w:eastAsia="Times New Roman" w:hAnsi="Times New Roman"/>
+          <w:sz w:val="28"/>
+          <w:szCs w:val="28"/>
+        </w:rPr>
+        <w:t xml:space="preserve">☐ Перевірити твердження про </w:t>
       </w:r>
       <w:r>
         <w:rPr>
@@ -4645,7 +5033,7 @@
           <w:sz w:val="28"/>
           <w:szCs w:val="28"/>
         </w:rPr>
-        <w:t xml:space="preserve">Менголда і Фолдса</w:t>
+        <w:t xml:space="preserve">Трусова (20× і 30×)</w:t>
       </w:r>
       <w:r>
         <w:rPr>
@@ -4663,7 +5051,7 @@
           <w:sz w:val="28"/>
           <w:szCs w:val="28"/>
         </w:rPr>
-        <w:t xml:space="preserve">Каплана і Хенлайна (p. 61)</w:t>
+        <w:t xml:space="preserve">Менголда і Фолдса</w:t>
       </w:r>
       <w:r>
         <w:rPr>
@@ -4681,29 +5069,15 @@
           <w:sz w:val="28"/>
           <w:szCs w:val="28"/>
         </w:rPr>
-        <w:t xml:space="preserve">Ламбертон і Стівена</w:t>
-      </w:r>
-      <w:r>
-        <w:rPr>
-          <w:rFonts w:ascii="Times New Roman" w:cs="Times New Roman" w:eastAsia="Times New Roman" w:hAnsi="Times New Roman"/>
-          <w:sz w:val="28"/>
-          <w:szCs w:val="28"/>
-        </w:rPr>
-        <w:t xml:space="preserve"> в оригіналах.</w:t>
-      </w:r>
-    </w:p>
-    <w:p>
-      <w:pPr>
-        <w:spacing w:after="0" w:before="0" w:line="360"/>
-        <w:ind w:left="709"/>
-      </w:pPr>
-      <w:r>
-        <w:rPr>
-          <w:rFonts w:ascii="Times New Roman" w:cs="Times New Roman" w:eastAsia="Times New Roman" w:hAnsi="Times New Roman"/>
-          <w:sz w:val="28"/>
-          <w:szCs w:val="28"/>
-        </w:rPr>
-        <w:t xml:space="preserve">☐ Перемалювати </w:t>
+        <w:t xml:space="preserve">Каплана і Хенлайна (p. 61)</w:t>
+      </w:r>
+      <w:r>
+        <w:rPr>
+          <w:rFonts w:ascii="Times New Roman" w:cs="Times New Roman" w:eastAsia="Times New Roman" w:hAnsi="Times New Roman"/>
+          <w:sz w:val="28"/>
+          <w:szCs w:val="28"/>
+        </w:rPr>
+        <w:t xml:space="preserve">, </w:t>
       </w:r>
       <w:r>
         <w:rPr>
@@ -4713,15 +5087,15 @@
           <w:sz w:val="28"/>
           <w:szCs w:val="28"/>
         </w:rPr>
-        <w:t xml:space="preserve">рис. 1.1 і 1.2</w:t>
-      </w:r>
-      <w:r>
-        <w:rPr>
-          <w:rFonts w:ascii="Times New Roman" w:cs="Times New Roman" w:eastAsia="Times New Roman" w:hAnsi="Times New Roman"/>
-          <w:sz w:val="28"/>
-          <w:szCs w:val="28"/>
-        </w:rPr>
-        <w:t xml:space="preserve"> у Word.</w:t>
+        <w:t xml:space="preserve">Ламбертон і Стівена</w:t>
+      </w:r>
+      <w:r>
+        <w:rPr>
+          <w:rFonts w:ascii="Times New Roman" w:cs="Times New Roman" w:eastAsia="Times New Roman" w:hAnsi="Times New Roman"/>
+          <w:sz w:val="28"/>
+          <w:szCs w:val="28"/>
+        </w:rPr>
+        <w:t xml:space="preserve"> в оригіналах.</w:t>
       </w:r>
     </w:p>
     <w:p>
@@ -4735,7 +5109,7 @@
           <w:sz w:val="28"/>
           <w:szCs w:val="28"/>
         </w:rPr>
-        <w:t xml:space="preserve">☐ Додати </w:t>
+        <w:t xml:space="preserve">☐ Перемалювати </w:t>
       </w:r>
       <w:r>
         <w:rPr>
@@ -4745,6 +5119,38 @@
           <w:sz w:val="28"/>
           <w:szCs w:val="28"/>
         </w:rPr>
+        <w:t xml:space="preserve">рис. 1.1 і 1.2</w:t>
+      </w:r>
+      <w:r>
+        <w:rPr>
+          <w:rFonts w:ascii="Times New Roman" w:cs="Times New Roman" w:eastAsia="Times New Roman" w:hAnsi="Times New Roman"/>
+          <w:sz w:val="28"/>
+          <w:szCs w:val="28"/>
+        </w:rPr>
+        <w:t xml:space="preserve"> у Word.</w:t>
+      </w:r>
+    </w:p>
+    <w:p>
+      <w:pPr>
+        <w:spacing w:after="0" w:before="0" w:line="360"/>
+        <w:ind w:left="709"/>
+      </w:pPr>
+      <w:r>
+        <w:rPr>
+          <w:rFonts w:ascii="Times New Roman" w:cs="Times New Roman" w:eastAsia="Times New Roman" w:hAnsi="Times New Roman"/>
+          <w:sz w:val="28"/>
+          <w:szCs w:val="28"/>
+        </w:rPr>
+        <w:t xml:space="preserve">☐ Уточнити вихідні дані </w:t>
+      </w:r>
+      <w:r>
+        <w:rPr>
+          <w:rFonts w:ascii="Times New Roman" w:cs="Times New Roman" w:eastAsia="Times New Roman" w:hAnsi="Times New Roman"/>
+          <w:b/>
+          <w:bCs/>
+          <w:sz w:val="28"/>
+          <w:szCs w:val="28"/>
+        </w:rPr>
         <w:t xml:space="preserve">Котлера і Келлера</w:t>
       </w:r>
       <w:r>
@@ -4753,7 +5159,7 @@
           <w:sz w:val="28"/>
           <w:szCs w:val="28"/>
         </w:rPr>
-        <w:t xml:space="preserve"> до списку джерел із повними вихідними даними.</w:t>
+        <w:t xml:space="preserve"> (джерело №6) за бібліотечним каталогом.</w:t>
       </w:r>
     </w:p>
     <w:p>

</xml_diff>